<commit_message>
Bonus Sponsor Lisensi Atlas Family Rp3.000.000 (semula Rp2.500.000)
Keputusan Coach 29 Oktober 2026: pola 2 paket Family per bulan selama
2 bulan lalu membina harus memberi > Rp25 jt dalam 90 hari tanpa Pool
Aktif. Hasil engine: Rp26.525.000 tanpa Pool, Rp32.525.000 dengan Pool.
Batas atas per paket 56,45% (plafon 60%). Audit ulang: semua skenario
aman. Uji baru di tests/family.test.ts; spesifikasi, ringkasan, audit,
dan draf Word Rencana Pemasaran v2.0 diperbarui.

Co-Authored-By: Claude Opus 5.5 <noreply@anthropic.com>
Claude-Session: https://claude.ai/code/session_01C9951NgictjxEvKqPLbNwt
</commit_message>
<xml_diff>
--- a/docs/dokumen-resmi/Rencana_Pemasaran_Mitrans-Astra_v2.0_DRAF.docx
+++ b/docs/dokumen-resmi/Rencana_Pemasaran_Mitrans-Astra_v2.0_DRAF.docx
@@ -6754,7 +6754,7 @@
                 <w:sz w:val="19"/>
                 <w:szCs w:val="19"/>
               </w:rPr>
-              <w:t xml:space="preserve">Rp750.000 per Lisensi Atlas yang dijual langsung; Rp2.500.000 per paket Lisensi Atlas Family</w:t>
+              <w:t xml:space="preserve">Rp750.000 per Lisensi Atlas yang dijual langsung; Rp3.000.000 per paket Lisensi Atlas Family</w:t>
             </w:r>
           </w:p>
         </w:tc>
@@ -8585,7 +8585,7 @@
                 <w:sz w:val="19"/>
                 <w:szCs w:val="19"/>
               </w:rPr>
-              <w:t xml:space="preserve">Bonus Sponsor Rp2.500.000 per paket, ditambah Fast Start Rp1.000.000 per kursi bila dijual dalam 90 hari pertamanya (paling banyak Rp5.500.000 per paket)</w:t>
+              <w:t xml:space="preserve">Bonus Sponsor Rp3.000.000 per paket, ditambah Fast Start Rp1.000.000 per kursi bila dijual dalam 90 hari pertamanya (paling banyak Rp6.000.000 per paket)</w:t>
             </w:r>
           </w:p>
         </w:tc>
@@ -16297,7 +16297,7 @@
         <w:pStyle w:val="Heading2"/>
       </w:pPr>
       <w:r>
-        <w:t xml:space="preserve">10.3 Contoh penjualan Lisensi Atlas Family</w:t>
+        <w:t xml:space="preserve">10.3 Contoh pola Lisensi Atlas Family: 2 paket per bulan selama 2 bulan</w:t>
       </w:r>
     </w:p>
     <w:p>
@@ -16305,7 +16305,46 @@
         <w:spacing w:after="120"/>
       </w:pPr>
       <w:r>
-        <w:t xml:space="preserve">Mitra PLS Contoh menjual 1 paket Lisensi Atlas Family pada bulan ke-2 dan 1 paket pada bulan ke-3 sejak aktivasi Lisensinya. Setiap paket diisi 3 orang dewasa yang masing-masing mendaftar sebagai Mitra PLS.</w:t>
+        <w:t xml:space="preserve">Keadaan yang diandaikan:</w:t>
+      </w:r>
+    </w:p>
+    <w:p>
+      <w:pPr>
+        <w:pStyle w:val="ListParagraph"/>
+        <w:numPr>
+          <w:ilvl w:val="0"/>
+          <w:numId w:val="2"/>
+        </w:numPr>
+        <w:spacing w:after="60"/>
+      </w:pPr>
+      <w:r>
+        <w:t xml:space="preserve">Mitra PLS Contoh mengaktifkan Lisensinya pada bulan ke-1, lalu menjual 2 paket Lisensi Atlas Family pada bulan ke-2 dan 2 paket pada bulan ke-3 (4 paket, 12 kursi). Setiap kursi diisi orang dewasa yang mendaftar sendiri sebagai Mitra PLS.</w:t>
+      </w:r>
+    </w:p>
+    <w:p>
+      <w:pPr>
+        <w:pStyle w:val="ListParagraph"/>
+        <w:numPr>
+          <w:ilvl w:val="0"/>
+          <w:numId w:val="2"/>
+        </w:numPr>
+        <w:spacing w:after="60"/>
+      </w:pPr>
+      <w:r>
+        <w:t xml:space="preserve">Setiap pemegang kursi utama yang ia sponsori melakukan pola yang sama pada bulan kedua dan ketiga sejak aktivasinya. Kursi kedua dan ketiga diandaikan belum menjual. Tidak ada pembatalan.</w:t>
+      </w:r>
+    </w:p>
+    <w:p>
+      <w:pPr>
+        <w:pStyle w:val="ListParagraph"/>
+        <w:numPr>
+          <w:ilvl w:val="0"/>
+          <w:numId w:val="2"/>
+        </w:numPr>
+        <w:spacing w:after="60"/>
+      </w:pPr>
+      <w:r>
+        <w:t xml:space="preserve">Pool Aktif bulan itu cukup besar sehingga setiap penjualan memperoleh bagian paling banyak Rp500.000.</w:t>
       </w:r>
     </w:p>
     <w:tbl>
@@ -16321,9 +16360,9 @@
         </w:tblBorders>
       </w:tblPr>
       <w:tblGrid>
-        <w:gridCol w:w="2920"/>
-        <w:gridCol w:w="4380"/>
-        <w:gridCol w:w="2338"/>
+        <w:gridCol w:w="2753"/>
+        <w:gridCol w:w="4681"/>
+        <w:gridCol w:w="2204"/>
       </w:tblGrid>
       <w:tr>
         <w:trPr>
@@ -16331,7 +16370,7 @@
         </w:trPr>
         <w:tc>
           <w:tcPr>
-            <w:tcW w:type="dxa" w:w="2920"/>
+            <w:tcW w:type="dxa" w:w="2753"/>
             <w:tcBorders>
               <w:top w:val="single" w:color="A6A6A6" w:sz="4"/>
               <w:left w:val="single" w:color="A6A6A6" w:sz="4"/>
@@ -16364,7 +16403,7 @@
         </w:tc>
         <w:tc>
           <w:tcPr>
-            <w:tcW w:type="dxa" w:w="4380"/>
+            <w:tcW w:type="dxa" w:w="4681"/>
             <w:tcBorders>
               <w:top w:val="single" w:color="A6A6A6" w:sz="4"/>
               <w:left w:val="single" w:color="A6A6A6" w:sz="4"/>
@@ -16397,7 +16436,7 @@
         </w:tc>
         <w:tc>
           <w:tcPr>
-            <w:tcW w:type="dxa" w:w="2338"/>
+            <w:tcW w:type="dxa" w:w="2204"/>
             <w:tcBorders>
               <w:top w:val="single" w:color="A6A6A6" w:sz="4"/>
               <w:left w:val="single" w:color="A6A6A6" w:sz="4"/>
@@ -16424,7 +16463,7 @@
                 <w:sz w:val="19"/>
                 <w:szCs w:val="19"/>
               </w:rPr>
-              <w:t xml:space="preserve">Jumlah</w:t>
+              <w:t xml:space="preserve">Jumlah 90 hari</w:t>
             </w:r>
           </w:p>
         </w:tc>
@@ -16432,7 +16471,7 @@
       <w:tr>
         <w:tc>
           <w:tcPr>
-            <w:tcW w:type="dxa" w:w="2920"/>
+            <w:tcW w:type="dxa" w:w="2753"/>
             <w:tcBorders>
               <w:top w:val="single" w:color="A6A6A6" w:sz="4"/>
               <w:left w:val="single" w:color="A6A6A6" w:sz="4"/>
@@ -16463,38 +16502,38 @@
         </w:tc>
         <w:tc>
           <w:tcPr>
-            <w:tcW w:type="dxa" w:w="4380"/>
-            <w:tcBorders>
-              <w:top w:val="single" w:color="A6A6A6" w:sz="4"/>
-              <w:left w:val="single" w:color="A6A6A6" w:sz="4"/>
-              <w:bottom w:val="single" w:color="A6A6A6" w:sz="4"/>
-              <w:right w:val="single" w:color="A6A6A6" w:sz="4"/>
-            </w:tcBorders>
-            <w:tcMar>
-              <w:top w:type="dxa" w:w="60"/>
-              <w:left w:type="dxa" w:w="100"/>
-              <w:bottom w:type="dxa" w:w="60"/>
-              <w:right w:type="dxa" w:w="100"/>
-            </w:tcMar>
-          </w:tcPr>
-          <w:p>
-            <w:pPr>
-              <w:jc w:val="left"/>
-            </w:pPr>
-            <w:r>
-              <w:rPr>
-                <w:b w:val="false"/>
-                <w:bCs w:val="false"/>
-                <w:sz w:val="19"/>
-                <w:szCs w:val="19"/>
-              </w:rPr>
-              <w:t xml:space="preserve">2 paket × Rp2.500.000</w:t>
-            </w:r>
-          </w:p>
-        </w:tc>
-        <w:tc>
-          <w:tcPr>
-            <w:tcW w:type="dxa" w:w="2338"/>
+            <w:tcW w:type="dxa" w:w="4681"/>
+            <w:tcBorders>
+              <w:top w:val="single" w:color="A6A6A6" w:sz="4"/>
+              <w:left w:val="single" w:color="A6A6A6" w:sz="4"/>
+              <w:bottom w:val="single" w:color="A6A6A6" w:sz="4"/>
+              <w:right w:val="single" w:color="A6A6A6" w:sz="4"/>
+            </w:tcBorders>
+            <w:tcMar>
+              <w:top w:type="dxa" w:w="60"/>
+              <w:left w:type="dxa" w:w="100"/>
+              <w:bottom w:type="dxa" w:w="60"/>
+              <w:right w:type="dxa" w:w="100"/>
+            </w:tcMar>
+          </w:tcPr>
+          <w:p>
+            <w:pPr>
+              <w:jc w:val="left"/>
+            </w:pPr>
+            <w:r>
+              <w:rPr>
+                <w:b w:val="false"/>
+                <w:bCs w:val="false"/>
+                <w:sz w:val="19"/>
+                <w:szCs w:val="19"/>
+              </w:rPr>
+              <w:t xml:space="preserve">4 paket × Rp3.000.000</w:t>
+            </w:r>
+          </w:p>
+        </w:tc>
+        <w:tc>
+          <w:tcPr>
+            <w:tcW w:type="dxa" w:w="2204"/>
             <w:tcBorders>
               <w:top w:val="single" w:color="A6A6A6" w:sz="4"/>
               <w:left w:val="single" w:color="A6A6A6" w:sz="4"/>
@@ -16519,7 +16558,7 @@
                 <w:sz w:val="19"/>
                 <w:szCs w:val="19"/>
               </w:rPr>
-              <w:t xml:space="preserve">Rp5.000.000</w:t>
+              <w:t xml:space="preserve">Rp12.000.000</w:t>
             </w:r>
           </w:p>
         </w:tc>
@@ -16527,7 +16566,7 @@
       <w:tr>
         <w:tc>
           <w:tcPr>
-            <w:tcW w:type="dxa" w:w="2920"/>
+            <w:tcW w:type="dxa" w:w="2753"/>
             <w:tcBorders>
               <w:top w:val="single" w:color="A6A6A6" w:sz="4"/>
               <w:left w:val="single" w:color="A6A6A6" w:sz="4"/>
@@ -16559,39 +16598,39 @@
         </w:tc>
         <w:tc>
           <w:tcPr>
-            <w:tcW w:type="dxa" w:w="4380"/>
-            <w:tcBorders>
-              <w:top w:val="single" w:color="A6A6A6" w:sz="4"/>
-              <w:left w:val="single" w:color="A6A6A6" w:sz="4"/>
-              <w:bottom w:val="single" w:color="A6A6A6" w:sz="4"/>
-              <w:right w:val="single" w:color="A6A6A6" w:sz="4"/>
-            </w:tcBorders>
-            <w:shd w:fill="F2F6FA" w:color="auto" w:val="clear"/>
-            <w:tcMar>
-              <w:top w:type="dxa" w:w="60"/>
-              <w:left w:type="dxa" w:w="100"/>
-              <w:bottom w:type="dxa" w:w="60"/>
-              <w:right w:type="dxa" w:w="100"/>
-            </w:tcMar>
-          </w:tcPr>
-          <w:p>
-            <w:pPr>
-              <w:jc w:val="left"/>
-            </w:pPr>
-            <w:r>
-              <w:rPr>
-                <w:b w:val="false"/>
-                <w:bCs w:val="false"/>
-                <w:sz w:val="19"/>
-                <w:szCs w:val="19"/>
-              </w:rPr>
-              <w:t xml:space="preserve">6 kursi × Rp1.000.000</w:t>
-            </w:r>
-          </w:p>
-        </w:tc>
-        <w:tc>
-          <w:tcPr>
-            <w:tcW w:type="dxa" w:w="2338"/>
+            <w:tcW w:type="dxa" w:w="4681"/>
+            <w:tcBorders>
+              <w:top w:val="single" w:color="A6A6A6" w:sz="4"/>
+              <w:left w:val="single" w:color="A6A6A6" w:sz="4"/>
+              <w:bottom w:val="single" w:color="A6A6A6" w:sz="4"/>
+              <w:right w:val="single" w:color="A6A6A6" w:sz="4"/>
+            </w:tcBorders>
+            <w:shd w:fill="F2F6FA" w:color="auto" w:val="clear"/>
+            <w:tcMar>
+              <w:top w:type="dxa" w:w="60"/>
+              <w:left w:type="dxa" w:w="100"/>
+              <w:bottom w:type="dxa" w:w="60"/>
+              <w:right w:type="dxa" w:w="100"/>
+            </w:tcMar>
+          </w:tcPr>
+          <w:p>
+            <w:pPr>
+              <w:jc w:val="left"/>
+            </w:pPr>
+            <w:r>
+              <w:rPr>
+                <w:b w:val="false"/>
+                <w:bCs w:val="false"/>
+                <w:sz w:val="19"/>
+                <w:szCs w:val="19"/>
+              </w:rPr>
+              <w:t xml:space="preserve">12 kursi × Rp1.000.000</w:t>
+            </w:r>
+          </w:p>
+        </w:tc>
+        <w:tc>
+          <w:tcPr>
+            <w:tcW w:type="dxa" w:w="2204"/>
             <w:tcBorders>
               <w:top w:val="single" w:color="A6A6A6" w:sz="4"/>
               <w:left w:val="single" w:color="A6A6A6" w:sz="4"/>
@@ -16617,7 +16656,7 @@
                 <w:sz w:val="19"/>
                 <w:szCs w:val="19"/>
               </w:rPr>
-              <w:t xml:space="preserve">Rp6.000.000</w:t>
+              <w:t xml:space="preserve">Rp12.000.000</w:t>
             </w:r>
           </w:p>
         </w:tc>
@@ -16625,7 +16664,7 @@
       <w:tr>
         <w:tc>
           <w:tcPr>
-            <w:tcW w:type="dxa" w:w="2920"/>
+            <w:tcW w:type="dxa" w:w="2753"/>
             <w:tcBorders>
               <w:top w:val="single" w:color="A6A6A6" w:sz="4"/>
               <w:left w:val="single" w:color="A6A6A6" w:sz="4"/>
@@ -16656,38 +16695,38 @@
         </w:tc>
         <w:tc>
           <w:tcPr>
-            <w:tcW w:type="dxa" w:w="4380"/>
-            <w:tcBorders>
-              <w:top w:val="single" w:color="A6A6A6" w:sz="4"/>
-              <w:left w:val="single" w:color="A6A6A6" w:sz="4"/>
-              <w:bottom w:val="single" w:color="A6A6A6" w:sz="4"/>
-              <w:right w:val="single" w:color="A6A6A6" w:sz="4"/>
-            </w:tcBorders>
-            <w:tcMar>
-              <w:top w:type="dxa" w:w="60"/>
-              <w:left w:type="dxa" w:w="100"/>
-              <w:bottom w:type="dxa" w:w="60"/>
-              <w:right w:type="dxa" w:w="100"/>
-            </w:tcMar>
-          </w:tcPr>
-          <w:p>
-            <w:pPr>
-              <w:jc w:val="left"/>
-            </w:pPr>
-            <w:r>
-              <w:rPr>
-                <w:b w:val="false"/>
-                <w:bCs w:val="false"/>
-                <w:sz w:val="19"/>
-                <w:szCs w:val="19"/>
-              </w:rPr>
-              <w:t xml:space="preserve">Sesuai jaringan yang terbentuk</w:t>
-            </w:r>
-          </w:p>
-        </w:tc>
-        <w:tc>
-          <w:tcPr>
-            <w:tcW w:type="dxa" w:w="2338"/>
+            <w:tcW w:type="dxa" w:w="4681"/>
+            <w:tcBorders>
+              <w:top w:val="single" w:color="A6A6A6" w:sz="4"/>
+              <w:left w:val="single" w:color="A6A6A6" w:sz="4"/>
+              <w:bottom w:val="single" w:color="A6A6A6" w:sz="4"/>
+              <w:right w:val="single" w:color="A6A6A6" w:sz="4"/>
+            </w:tcBorders>
+            <w:tcMar>
+              <w:top w:type="dxa" w:w="60"/>
+              <w:left w:type="dxa" w:w="100"/>
+              <w:bottom w:type="dxa" w:w="60"/>
+              <w:right w:type="dxa" w:w="100"/>
+            </w:tcMar>
+          </w:tcPr>
+          <w:p>
+            <w:pPr>
+              <w:jc w:val="left"/>
+            </w:pPr>
+            <w:r>
+              <w:rPr>
+                <w:b w:val="false"/>
+                <w:bCs w:val="false"/>
+                <w:sz w:val="19"/>
+                <w:szCs w:val="19"/>
+              </w:rPr>
+              <w:t xml:space="preserve">Sesuai jaringan yang terbentuk dalam 90 hari</w:t>
+            </w:r>
+          </w:p>
+        </w:tc>
+        <w:tc>
+          <w:tcPr>
+            <w:tcW w:type="dxa" w:w="2204"/>
             <w:tcBorders>
               <w:top w:val="single" w:color="A6A6A6" w:sz="4"/>
               <w:left w:val="single" w:color="A6A6A6" w:sz="4"/>
@@ -16712,7 +16751,7 @@
                 <w:sz w:val="19"/>
                 <w:szCs w:val="19"/>
               </w:rPr>
-              <w:t xml:space="preserve">Rp450.000</w:t>
+              <w:t xml:space="preserve">Rp1.800.000</w:t>
             </w:r>
           </w:p>
         </w:tc>
@@ -16720,7 +16759,7 @@
       <w:tr>
         <w:tc>
           <w:tcPr>
-            <w:tcW w:type="dxa" w:w="2920"/>
+            <w:tcW w:type="dxa" w:w="2753"/>
             <w:tcBorders>
               <w:top w:val="single" w:color="A6A6A6" w:sz="4"/>
               <w:left w:val="single" w:color="A6A6A6" w:sz="4"/>
@@ -16752,39 +16791,39 @@
         </w:tc>
         <w:tc>
           <w:tcPr>
-            <w:tcW w:type="dxa" w:w="4380"/>
-            <w:tcBorders>
-              <w:top w:val="single" w:color="A6A6A6" w:sz="4"/>
-              <w:left w:val="single" w:color="A6A6A6" w:sz="4"/>
-              <w:bottom w:val="single" w:color="A6A6A6" w:sz="4"/>
-              <w:right w:val="single" w:color="A6A6A6" w:sz="4"/>
-            </w:tcBorders>
-            <w:shd w:fill="F2F6FA" w:color="auto" w:val="clear"/>
-            <w:tcMar>
-              <w:top w:type="dxa" w:w="60"/>
-              <w:left w:type="dxa" w:w="100"/>
-              <w:bottom w:type="dxa" w:w="60"/>
-              <w:right w:type="dxa" w:w="100"/>
-            </w:tcMar>
-          </w:tcPr>
-          <w:p>
-            <w:pPr>
-              <w:jc w:val="left"/>
-            </w:pPr>
-            <w:r>
-              <w:rPr>
-                <w:b w:val="false"/>
-                <w:bCs w:val="false"/>
-                <w:sz w:val="19"/>
-                <w:szCs w:val="19"/>
-              </w:rPr>
-              <w:t xml:space="preserve">25% × Bonus Pasangan kursi utama yang ia sponsori</w:t>
-            </w:r>
-          </w:p>
-        </w:tc>
-        <w:tc>
-          <w:tcPr>
-            <w:tcW w:type="dxa" w:w="2338"/>
+            <w:tcW w:type="dxa" w:w="4681"/>
+            <w:tcBorders>
+              <w:top w:val="single" w:color="A6A6A6" w:sz="4"/>
+              <w:left w:val="single" w:color="A6A6A6" w:sz="4"/>
+              <w:bottom w:val="single" w:color="A6A6A6" w:sz="4"/>
+              <w:right w:val="single" w:color="A6A6A6" w:sz="4"/>
+            </w:tcBorders>
+            <w:shd w:fill="F2F6FA" w:color="auto" w:val="clear"/>
+            <w:tcMar>
+              <w:top w:type="dxa" w:w="60"/>
+              <w:left w:type="dxa" w:w="100"/>
+              <w:bottom w:type="dxa" w:w="60"/>
+              <w:right w:type="dxa" w:w="100"/>
+            </w:tcMar>
+          </w:tcPr>
+          <w:p>
+            <w:pPr>
+              <w:jc w:val="left"/>
+            </w:pPr>
+            <w:r>
+              <w:rPr>
+                <w:b w:val="false"/>
+                <w:bCs w:val="false"/>
+                <w:sz w:val="19"/>
+                <w:szCs w:val="19"/>
+              </w:rPr>
+              <w:t xml:space="preserve">25% × Bonus Pasangan generasi 1–3</w:t>
+            </w:r>
+          </w:p>
+        </w:tc>
+        <w:tc>
+          <w:tcPr>
+            <w:tcW w:type="dxa" w:w="2204"/>
             <w:tcBorders>
               <w:top w:val="single" w:color="A6A6A6" w:sz="4"/>
               <w:left w:val="single" w:color="A6A6A6" w:sz="4"/>
@@ -16810,7 +16849,7 @@
                 <w:sz w:val="19"/>
                 <w:szCs w:val="19"/>
               </w:rPr>
-              <w:t xml:space="preserve">Rp75.000</w:t>
+              <w:t xml:space="preserve">Rp525.000</w:t>
             </w:r>
           </w:p>
         </w:tc>
@@ -16818,13 +16857,109 @@
       <w:tr>
         <w:tc>
           <w:tcPr>
-            <w:tcW w:type="dxa" w:w="2920"/>
-            <w:tcBorders>
-              <w:top w:val="single" w:color="A6A6A6" w:sz="4"/>
-              <w:left w:val="single" w:color="A6A6A6" w:sz="4"/>
-              <w:bottom w:val="single" w:color="A6A6A6" w:sz="4"/>
-              <w:right w:val="single" w:color="A6A6A6" w:sz="4"/>
-            </w:tcBorders>
+            <w:tcW w:type="dxa" w:w="2753"/>
+            <w:tcBorders>
+              <w:top w:val="single" w:color="A6A6A6" w:sz="4"/>
+              <w:left w:val="single" w:color="A6A6A6" w:sz="4"/>
+              <w:bottom w:val="single" w:color="A6A6A6" w:sz="4"/>
+              <w:right w:val="single" w:color="A6A6A6" w:sz="4"/>
+            </w:tcBorders>
+            <w:tcMar>
+              <w:top w:type="dxa" w:w="60"/>
+              <w:left w:type="dxa" w:w="100"/>
+              <w:bottom w:type="dxa" w:w="60"/>
+              <w:right w:type="dxa" w:w="100"/>
+            </w:tcMar>
+          </w:tcPr>
+          <w:p>
+            <w:pPr>
+              <w:jc w:val="left"/>
+            </w:pPr>
+            <w:r>
+              <w:rPr>
+                <w:b w:val="false"/>
+                <w:bCs w:val="false"/>
+                <w:sz w:val="19"/>
+                <w:szCs w:val="19"/>
+              </w:rPr>
+              <w:t xml:space="preserve">Bonus Pendamping</w:t>
+            </w:r>
+          </w:p>
+        </w:tc>
+        <w:tc>
+          <w:tcPr>
+            <w:tcW w:type="dxa" w:w="4681"/>
+            <w:tcBorders>
+              <w:top w:val="single" w:color="A6A6A6" w:sz="4"/>
+              <w:left w:val="single" w:color="A6A6A6" w:sz="4"/>
+              <w:bottom w:val="single" w:color="A6A6A6" w:sz="4"/>
+              <w:right w:val="single" w:color="A6A6A6" w:sz="4"/>
+            </w:tcBorders>
+            <w:tcMar>
+              <w:top w:type="dxa" w:w="60"/>
+              <w:left w:type="dxa" w:w="100"/>
+              <w:bottom w:type="dxa" w:w="60"/>
+              <w:right w:type="dxa" w:w="100"/>
+            </w:tcMar>
+          </w:tcPr>
+          <w:p>
+            <w:pPr>
+              <w:jc w:val="left"/>
+            </w:pPr>
+            <w:r>
+              <w:rPr>
+                <w:b w:val="false"/>
+                <w:bCs w:val="false"/>
+                <w:sz w:val="19"/>
+                <w:szCs w:val="19"/>
+              </w:rPr>
+              <w:t xml:space="preserve">2 kursi utama binaan membuat penjualan Fast Start pertamanya dalam 90 hari Mitra PLS Contoh</w:t>
+            </w:r>
+          </w:p>
+        </w:tc>
+        <w:tc>
+          <w:tcPr>
+            <w:tcW w:type="dxa" w:w="2204"/>
+            <w:tcBorders>
+              <w:top w:val="single" w:color="A6A6A6" w:sz="4"/>
+              <w:left w:val="single" w:color="A6A6A6" w:sz="4"/>
+              <w:bottom w:val="single" w:color="A6A6A6" w:sz="4"/>
+              <w:right w:val="single" w:color="A6A6A6" w:sz="4"/>
+            </w:tcBorders>
+            <w:tcMar>
+              <w:top w:type="dxa" w:w="60"/>
+              <w:left w:type="dxa" w:w="100"/>
+              <w:bottom w:type="dxa" w:w="60"/>
+              <w:right w:type="dxa" w:w="100"/>
+            </w:tcMar>
+          </w:tcPr>
+          <w:p>
+            <w:pPr>
+              <w:jc w:val="right"/>
+            </w:pPr>
+            <w:r>
+              <w:rPr>
+                <w:b w:val="false"/>
+                <w:bCs w:val="false"/>
+                <w:sz w:val="19"/>
+                <w:szCs w:val="19"/>
+              </w:rPr>
+              <w:t xml:space="preserve">Rp200.000</w:t>
+            </w:r>
+          </w:p>
+        </w:tc>
+      </w:tr>
+      <w:tr>
+        <w:tc>
+          <w:tcPr>
+            <w:tcW w:type="dxa" w:w="2753"/>
+            <w:tcBorders>
+              <w:top w:val="single" w:color="A6A6A6" w:sz="4"/>
+              <w:left w:val="single" w:color="A6A6A6" w:sz="4"/>
+              <w:bottom w:val="single" w:color="A6A6A6" w:sz="4"/>
+              <w:right w:val="single" w:color="A6A6A6" w:sz="4"/>
+            </w:tcBorders>
+            <w:shd w:fill="F2F6FA" w:color="auto" w:val="clear"/>
             <w:tcMar>
               <w:top w:type="dxa" w:w="60"/>
               <w:left w:type="dxa" w:w="100"/>
@@ -16849,35 +16984,37 @@
         </w:tc>
         <w:tc>
           <w:tcPr>
-            <w:tcW w:type="dxa" w:w="4380"/>
-            <w:tcBorders>
-              <w:top w:val="single" w:color="A6A6A6" w:sz="4"/>
-              <w:left w:val="single" w:color="A6A6A6" w:sz="4"/>
-              <w:bottom w:val="single" w:color="A6A6A6" w:sz="4"/>
-              <w:right w:val="single" w:color="A6A6A6" w:sz="4"/>
-            </w:tcBorders>
-            <w:tcMar>
-              <w:top w:type="dxa" w:w="60"/>
-              <w:left w:type="dxa" w:w="100"/>
-              <w:bottom w:type="dxa" w:w="60"/>
-              <w:right w:type="dxa" w:w="100"/>
-            </w:tcMar>
-          </w:tcPr>
-          <w:p>
-            <w:pPr>
-              <w:jc w:val="left"/>
-            </w:pPr>
-          </w:p>
-        </w:tc>
-        <w:tc>
-          <w:tcPr>
-            <w:tcW w:type="dxa" w:w="2338"/>
-            <w:tcBorders>
-              <w:top w:val="single" w:color="A6A6A6" w:sz="4"/>
-              <w:left w:val="single" w:color="A6A6A6" w:sz="4"/>
-              <w:bottom w:val="single" w:color="A6A6A6" w:sz="4"/>
-              <w:right w:val="single" w:color="A6A6A6" w:sz="4"/>
-            </w:tcBorders>
+            <w:tcW w:type="dxa" w:w="4681"/>
+            <w:tcBorders>
+              <w:top w:val="single" w:color="A6A6A6" w:sz="4"/>
+              <w:left w:val="single" w:color="A6A6A6" w:sz="4"/>
+              <w:bottom w:val="single" w:color="A6A6A6" w:sz="4"/>
+              <w:right w:val="single" w:color="A6A6A6" w:sz="4"/>
+            </w:tcBorders>
+            <w:shd w:fill="F2F6FA" w:color="auto" w:val="clear"/>
+            <w:tcMar>
+              <w:top w:type="dxa" w:w="60"/>
+              <w:left w:type="dxa" w:w="100"/>
+              <w:bottom w:type="dxa" w:w="60"/>
+              <w:right w:type="dxa" w:w="100"/>
+            </w:tcMar>
+          </w:tcPr>
+          <w:p>
+            <w:pPr>
+              <w:jc w:val="left"/>
+            </w:pPr>
+          </w:p>
+        </w:tc>
+        <w:tc>
+          <w:tcPr>
+            <w:tcW w:type="dxa" w:w="2204"/>
+            <w:tcBorders>
+              <w:top w:val="single" w:color="A6A6A6" w:sz="4"/>
+              <w:left w:val="single" w:color="A6A6A6" w:sz="4"/>
+              <w:bottom w:val="single" w:color="A6A6A6" w:sz="4"/>
+              <w:right w:val="single" w:color="A6A6A6" w:sz="4"/>
+            </w:tcBorders>
+            <w:shd w:fill="F2F6FA" w:color="auto" w:val="clear"/>
             <w:tcMar>
               <w:top w:type="dxa" w:w="60"/>
               <w:left w:type="dxa" w:w="100"/>
@@ -16896,7 +17033,7 @@
                 <w:sz w:val="19"/>
                 <w:szCs w:val="19"/>
               </w:rPr>
-              <w:t xml:space="preserve">Rp11.525.000</w:t>
+              <w:t xml:space="preserve">Rp26.525.000</w:t>
             </w:r>
           </w:p>
         </w:tc>
@@ -16904,14 +17041,13 @@
       <w:tr>
         <w:tc>
           <w:tcPr>
-            <w:tcW w:type="dxa" w:w="2920"/>
-            <w:tcBorders>
-              <w:top w:val="single" w:color="A6A6A6" w:sz="4"/>
-              <w:left w:val="single" w:color="A6A6A6" w:sz="4"/>
-              <w:bottom w:val="single" w:color="A6A6A6" w:sz="4"/>
-              <w:right w:val="single" w:color="A6A6A6" w:sz="4"/>
-            </w:tcBorders>
-            <w:shd w:fill="F2F6FA" w:color="auto" w:val="clear"/>
+            <w:tcW w:type="dxa" w:w="2753"/>
+            <w:tcBorders>
+              <w:top w:val="single" w:color="A6A6A6" w:sz="4"/>
+              <w:left w:val="single" w:color="A6A6A6" w:sz="4"/>
+              <w:bottom w:val="single" w:color="A6A6A6" w:sz="4"/>
+              <w:right w:val="single" w:color="A6A6A6" w:sz="4"/>
+            </w:tcBorders>
             <w:tcMar>
               <w:top w:type="dxa" w:w="60"/>
               <w:left w:type="dxa" w:w="100"/>
@@ -16936,46 +17072,44 @@
         </w:tc>
         <w:tc>
           <w:tcPr>
-            <w:tcW w:type="dxa" w:w="4380"/>
-            <w:tcBorders>
-              <w:top w:val="single" w:color="A6A6A6" w:sz="4"/>
-              <w:left w:val="single" w:color="A6A6A6" w:sz="4"/>
-              <w:bottom w:val="single" w:color="A6A6A6" w:sz="4"/>
-              <w:right w:val="single" w:color="A6A6A6" w:sz="4"/>
-            </w:tcBorders>
-            <w:shd w:fill="F2F6FA" w:color="auto" w:val="clear"/>
-            <w:tcMar>
-              <w:top w:type="dxa" w:w="60"/>
-              <w:left w:type="dxa" w:w="100"/>
-              <w:bottom w:type="dxa" w:w="60"/>
-              <w:right w:type="dxa" w:w="100"/>
-            </w:tcMar>
-          </w:tcPr>
-          <w:p>
-            <w:pPr>
-              <w:jc w:val="left"/>
-            </w:pPr>
-            <w:r>
-              <w:rPr>
-                <w:b w:val="false"/>
-                <w:bCs w:val="false"/>
-                <w:sz w:val="19"/>
-                <w:szCs w:val="19"/>
-              </w:rPr>
-              <w:t xml:space="preserve">6 penjualan × paling banyak Rp500.000</w:t>
-            </w:r>
-          </w:p>
-        </w:tc>
-        <w:tc>
-          <w:tcPr>
-            <w:tcW w:type="dxa" w:w="2338"/>
-            <w:tcBorders>
-              <w:top w:val="single" w:color="A6A6A6" w:sz="4"/>
-              <w:left w:val="single" w:color="A6A6A6" w:sz="4"/>
-              <w:bottom w:val="single" w:color="A6A6A6" w:sz="4"/>
-              <w:right w:val="single" w:color="A6A6A6" w:sz="4"/>
-            </w:tcBorders>
-            <w:shd w:fill="F2F6FA" w:color="auto" w:val="clear"/>
+            <w:tcW w:type="dxa" w:w="4681"/>
+            <w:tcBorders>
+              <w:top w:val="single" w:color="A6A6A6" w:sz="4"/>
+              <w:left w:val="single" w:color="A6A6A6" w:sz="4"/>
+              <w:bottom w:val="single" w:color="A6A6A6" w:sz="4"/>
+              <w:right w:val="single" w:color="A6A6A6" w:sz="4"/>
+            </w:tcBorders>
+            <w:tcMar>
+              <w:top w:type="dxa" w:w="60"/>
+              <w:left w:type="dxa" w:w="100"/>
+              <w:bottom w:type="dxa" w:w="60"/>
+              <w:right w:type="dxa" w:w="100"/>
+            </w:tcMar>
+          </w:tcPr>
+          <w:p>
+            <w:pPr>
+              <w:jc w:val="left"/>
+            </w:pPr>
+            <w:r>
+              <w:rPr>
+                <w:b w:val="false"/>
+                <w:bCs w:val="false"/>
+                <w:sz w:val="19"/>
+                <w:szCs w:val="19"/>
+              </w:rPr>
+              <w:t xml:space="preserve">12 penjualan × paling banyak Rp500.000 (tidak tetap)</w:t>
+            </w:r>
+          </w:p>
+        </w:tc>
+        <w:tc>
+          <w:tcPr>
+            <w:tcW w:type="dxa" w:w="2204"/>
+            <w:tcBorders>
+              <w:top w:val="single" w:color="A6A6A6" w:sz="4"/>
+              <w:left w:val="single" w:color="A6A6A6" w:sz="4"/>
+              <w:bottom w:val="single" w:color="A6A6A6" w:sz="4"/>
+              <w:right w:val="single" w:color="A6A6A6" w:sz="4"/>
+            </w:tcBorders>
             <w:tcMar>
               <w:top w:type="dxa" w:w="60"/>
               <w:left w:type="dxa" w:w="100"/>
@@ -16994,7 +17128,7 @@
                 <w:sz w:val="19"/>
                 <w:szCs w:val="19"/>
               </w:rPr>
-              <w:t xml:space="preserve">Rp3.000.000</w:t>
+              <w:t xml:space="preserve">Rp6.000.000</w:t>
             </w:r>
           </w:p>
         </w:tc>
@@ -17002,13 +17136,14 @@
       <w:tr>
         <w:tc>
           <w:tcPr>
-            <w:tcW w:type="dxa" w:w="2920"/>
-            <w:tcBorders>
-              <w:top w:val="single" w:color="A6A6A6" w:sz="4"/>
-              <w:left w:val="single" w:color="A6A6A6" w:sz="4"/>
-              <w:bottom w:val="single" w:color="A6A6A6" w:sz="4"/>
-              <w:right w:val="single" w:color="A6A6A6" w:sz="4"/>
-            </w:tcBorders>
+            <w:tcW w:type="dxa" w:w="2753"/>
+            <w:tcBorders>
+              <w:top w:val="single" w:color="A6A6A6" w:sz="4"/>
+              <w:left w:val="single" w:color="A6A6A6" w:sz="4"/>
+              <w:bottom w:val="single" w:color="A6A6A6" w:sz="4"/>
+              <w:right w:val="single" w:color="A6A6A6" w:sz="4"/>
+            </w:tcBorders>
+            <w:shd w:fill="F2F6FA" w:color="auto" w:val="clear"/>
             <w:tcMar>
               <w:top w:type="dxa" w:w="60"/>
               <w:left w:type="dxa" w:w="100"/>
@@ -17033,35 +17168,37 @@
         </w:tc>
         <w:tc>
           <w:tcPr>
-            <w:tcW w:type="dxa" w:w="4380"/>
-            <w:tcBorders>
-              <w:top w:val="single" w:color="A6A6A6" w:sz="4"/>
-              <w:left w:val="single" w:color="A6A6A6" w:sz="4"/>
-              <w:bottom w:val="single" w:color="A6A6A6" w:sz="4"/>
-              <w:right w:val="single" w:color="A6A6A6" w:sz="4"/>
-            </w:tcBorders>
-            <w:tcMar>
-              <w:top w:type="dxa" w:w="60"/>
-              <w:left w:type="dxa" w:w="100"/>
-              <w:bottom w:type="dxa" w:w="60"/>
-              <w:right w:type="dxa" w:w="100"/>
-            </w:tcMar>
-          </w:tcPr>
-          <w:p>
-            <w:pPr>
-              <w:jc w:val="left"/>
-            </w:pPr>
-          </w:p>
-        </w:tc>
-        <w:tc>
-          <w:tcPr>
-            <w:tcW w:type="dxa" w:w="2338"/>
-            <w:tcBorders>
-              <w:top w:val="single" w:color="A6A6A6" w:sz="4"/>
-              <w:left w:val="single" w:color="A6A6A6" w:sz="4"/>
-              <w:bottom w:val="single" w:color="A6A6A6" w:sz="4"/>
-              <w:right w:val="single" w:color="A6A6A6" w:sz="4"/>
-            </w:tcBorders>
+            <w:tcW w:type="dxa" w:w="4681"/>
+            <w:tcBorders>
+              <w:top w:val="single" w:color="A6A6A6" w:sz="4"/>
+              <w:left w:val="single" w:color="A6A6A6" w:sz="4"/>
+              <w:bottom w:val="single" w:color="A6A6A6" w:sz="4"/>
+              <w:right w:val="single" w:color="A6A6A6" w:sz="4"/>
+            </w:tcBorders>
+            <w:shd w:fill="F2F6FA" w:color="auto" w:val="clear"/>
+            <w:tcMar>
+              <w:top w:type="dxa" w:w="60"/>
+              <w:left w:type="dxa" w:w="100"/>
+              <w:bottom w:type="dxa" w:w="60"/>
+              <w:right w:type="dxa" w:w="100"/>
+            </w:tcMar>
+          </w:tcPr>
+          <w:p>
+            <w:pPr>
+              <w:jc w:val="left"/>
+            </w:pPr>
+          </w:p>
+        </w:tc>
+        <w:tc>
+          <w:tcPr>
+            <w:tcW w:type="dxa" w:w="2204"/>
+            <w:tcBorders>
+              <w:top w:val="single" w:color="A6A6A6" w:sz="4"/>
+              <w:left w:val="single" w:color="A6A6A6" w:sz="4"/>
+              <w:bottom w:val="single" w:color="A6A6A6" w:sz="4"/>
+              <w:right w:val="single" w:color="A6A6A6" w:sz="4"/>
+            </w:tcBorders>
+            <w:shd w:fill="F2F6FA" w:color="auto" w:val="clear"/>
             <w:tcMar>
               <w:top w:type="dxa" w:w="60"/>
               <w:left w:type="dxa" w:w="100"/>
@@ -17080,7 +17217,7 @@
                 <w:sz w:val="19"/>
                 <w:szCs w:val="19"/>
               </w:rPr>
-              <w:t xml:space="preserve">Rp14.525.000</w:t>
+              <w:t xml:space="preserve">Rp32.525.000</w:t>
             </w:r>
           </w:p>
         </w:tc>
@@ -17093,7 +17230,38 @@
     </w:p>
     <w:p>
       <w:pPr>
-        <w:spacing w:after="120"/>
+        <w:pStyle w:val="ListParagraph"/>
+        <w:numPr>
+          <w:ilvl w:val="0"/>
+          <w:numId w:val="2"/>
+        </w:numPr>
+        <w:spacing w:after="60"/>
+      </w:pPr>
+      <w:r>
+        <w:t xml:space="preserve">Angka bruto, sebelum pajak penghasilan. Pola ini berarti menjual 4 paket senilai Rp100.000.000 dalam 2 bulan, dan jumlah keluarga yang dibutuhkan berlipat setiap bulan, sehingga tidak dapat berlangsung terus.</w:t>
+      </w:r>
+    </w:p>
+    <w:p>
+      <w:pPr>
+        <w:pStyle w:val="ListParagraph"/>
+        <w:numPr>
+          <w:ilvl w:val="0"/>
+          <w:numId w:val="2"/>
+        </w:numPr>
+        <w:spacing w:after="60"/>
+      </w:pPr>
+      <w:r>
+        <w:t xml:space="preserve">Bila Mitra PLS Contoh menjual 1 paket per bulan selama 2 bulan, jumlahnya Rp12.525.000 tanpa Pool Aktif.</w:t>
+      </w:r>
+    </w:p>
+    <w:p>
+      <w:pPr>
+        <w:pStyle w:val="ListParagraph"/>
+        <w:numPr>
+          <w:ilvl w:val="0"/>
+          <w:numId w:val="2"/>
+        </w:numPr>
+        <w:spacing w:after="60"/>
       </w:pPr>
       <w:r>
         <w:t xml:space="preserve">Pemegang kursi utama tidak menerima Bonus Sponsor maupun Fast Start dari keluarganya. Ia memperoleh 1 pasangan (Rp150.000) dari kursi kedua dan ketiga, yang dibayar setelah ia aktif.</w:t>
@@ -18974,7 +19142,7 @@
                 <w:sz w:val="19"/>
                 <w:szCs w:val="19"/>
               </w:rPr>
-              <w:t xml:space="preserve">(Rp2.500.000 + 3 × (Rp1.000.000 + Rp100.000 + 5 × Rp150.000 × 1,90)) ÷ Rp22.522.523 + 4,5% + 5%</w:t>
+              <w:t xml:space="preserve">(Rp3.000.000 + 3 × (Rp1.000.000 + Rp100.000 + 5 × Rp150.000 × 1,90)) ÷ Rp22.522.523 + 4,5% + 5%</w:t>
             </w:r>
           </w:p>
         </w:tc>
@@ -19005,7 +19173,7 @@
                 <w:sz w:val="19"/>
                 <w:szCs w:val="19"/>
               </w:rPr>
-              <w:t xml:space="preserve">54,23%</w:t>
+              <w:t xml:space="preserve">56,45%</w:t>
             </w:r>
           </w:p>
         </w:tc>
@@ -20080,7 +20248,7 @@
                 <w:sz w:val="19"/>
                 <w:szCs w:val="19"/>
               </w:rPr>
-              <w:t xml:space="preserve">19,3%</w:t>
+              <w:t xml:space="preserve">20,3%</w:t>
             </w:r>
           </w:p>
         </w:tc>
@@ -20144,7 +20312,7 @@
                 <w:sz w:val="19"/>
                 <w:szCs w:val="19"/>
               </w:rPr>
-              <w:t xml:space="preserve">52,1%</w:t>
+              <w:t xml:space="preserve">51,6%</w:t>
             </w:r>
           </w:p>
         </w:tc>
@@ -20272,7 +20440,7 @@
                 <w:sz w:val="19"/>
                 <w:szCs w:val="19"/>
               </w:rPr>
-              <w:t xml:space="preserve">20,3%</w:t>
+              <w:t xml:space="preserve">21,8%</w:t>
             </w:r>
           </w:p>
         </w:tc>
@@ -20334,7 +20502,7 @@
                 <w:sz w:val="19"/>
                 <w:szCs w:val="19"/>
               </w:rPr>
-              <w:t xml:space="preserve">50,1%</w:t>
+              <w:t xml:space="preserve">49,2%</w:t>
             </w:r>
           </w:p>
         </w:tc>
@@ -25838,7 +26006,7 @@
                 <w:sz w:val="19"/>
                 <w:szCs w:val="19"/>
               </w:rPr>
-              <w:t xml:space="preserve">Bonus Sponsor Rp2.500.000 per paket + Fast Start per kursi</w:t>
+              <w:t xml:space="preserve">Bonus Sponsor Rp3.000.000 per paket + Fast Start per kursi</w:t>
             </w:r>
           </w:p>
         </w:tc>

</xml_diff>

<commit_message>
Bonus Pembinaan hanya dari Bonus Pasangan yang benar-benar dibayar
Keputusan Coach 29 Oktober 2026 (spesifikasi keputusan 23). Pembinaan kini
dihitung pada tutup bulan dari Bonus Pasangan generasi 1-6 yang dibayar
(setelah faktor plafon); pasangan yang ditahan memberi Pembinaan saat
dilepas, yang hangus tidak. Pola Lisensi 90 hari tetap Rp9.875.000; pola
Family 90 hari menjadi Rp32.300.000 (Rp26.300.000 tanpa Pool). Simulasi 12
level, Rencana Pemasaran, halaman Aturan, ringkasan, dan uji diperbarui
(138 uji lulus).

Co-Authored-By: Claude Opus 5.5 <noreply@anthropic.com>
Claude-Session: https://claude.ai/code/session_01C9951NgictjxEvKqPLbNwt
</commit_message>
<xml_diff>
--- a/docs/dokumen-resmi/Rencana_Pemasaran_Mitrans-Astra_v2.0_DRAF.docx
+++ b/docs/dokumen-resmi/Rencana_Pemasaran_Mitrans-Astra_v2.0_DRAF.docx
@@ -7654,7 +7654,7 @@
                 <w:sz w:val="19"/>
                 <w:szCs w:val="19"/>
               </w:rPr>
-              <w:t xml:space="preserve">Persentase Bonus Pasangan Mitra PLS yang disponsori: generasi 1–3 masing-masing 25%, generasi 4–6 masing-masing 5%</w:t>
+              <w:t xml:space="preserve">Persentase Bonus Pasangan yang benar-benar dibayar kepada Mitra PLS yang disponsori: generasi 1–3 masing-masing 25%, generasi 4–6 masing-masing 5%. Bonus Pasangan yang ditahan atau hangus tidak menimbulkan Bonus Pembinaan</w:t>
             </w:r>
           </w:p>
         </w:tc>
@@ -17077,7 +17077,7 @@
                 <w:sz w:val="19"/>
                 <w:szCs w:val="19"/>
               </w:rPr>
-              <w:t xml:space="preserve">25% × Bonus Pasangan generasi 1–3</w:t>
+              <w:t xml:space="preserve">25% × Bonus Pasangan generasi 1–3 yang sudah dibayar</w:t>
             </w:r>
           </w:p>
         </w:tc>
@@ -17109,7 +17109,7 @@
                 <w:sz w:val="19"/>
                 <w:szCs w:val="19"/>
               </w:rPr>
-              <w:t xml:space="preserve">Rp525.000</w:t>
+              <w:t xml:space="preserve">Rp300.000</w:t>
             </w:r>
           </w:p>
         </w:tc>
@@ -17293,7 +17293,7 @@
                 <w:sz w:val="19"/>
                 <w:szCs w:val="19"/>
               </w:rPr>
-              <w:t xml:space="preserve">Rp26.525.000</w:t>
+              <w:t xml:space="preserve">Rp26.300.000</w:t>
             </w:r>
           </w:p>
         </w:tc>
@@ -17477,7 +17477,7 @@
                 <w:sz w:val="19"/>
                 <w:szCs w:val="19"/>
               </w:rPr>
-              <w:t xml:space="preserve">Rp32.525.000</w:t>
+              <w:t xml:space="preserve">Rp32.300.000</w:t>
             </w:r>
           </w:p>
         </w:tc>
@@ -25817,7 +25817,7 @@
         <w:spacing w:after="120"/>
       </w:pPr>
       <w:r>
-        <w:t xml:space="preserve">Bonus Pembinaan hanya dibayar bila Mitra PLS penerima aktif pada bulan itu. Bila tidak, bonus ditahan sesuai bagian 9.3.</w:t>
+        <w:t xml:space="preserve">Bonus Pembinaan timbul pada tutup bulan saat Bonus Pasangan generasi itu benar-benar dibayar; Bonus Pasangan yang ditahan memberi Pembinaan saat dilepas, dan yang hangus tidak memberi Pembinaan. Bonus Pembinaan hanya dibayar bila Mitra PLS penerima aktif pada bulan itu; bila tidak, bonus ditahan sesuai bagian 9.3.</w:t>
       </w:r>
     </w:p>
     <w:p>

</xml_diff>